<commit_message>
Clarify test plan case status and evidence traceability
</commit_message>
<xml_diff>
--- a/HospitalPatientPathway/deliverables/Hospital_Patient_Pathway_Business_Process_Test_Plan_ZH.docx
+++ b/HospitalPatientPathway/deliverables/Hospital_Patient_Pathway_Business_Process_Test_Plan_ZH.docx
@@ -24,7 +24,55 @@
           <w:b w:val="0"/>
           <w:color w:val="525E68"/>
         </w:rPr>
-        <w:t>文档版本：V1.0　编制日期：2026 年 9 月 29 日　适用对象：本仓库的 Camunda 8 医院患者路径本地演示版本。</w:t>
+        <w:t>文档版本：V1.1　修订日期：2026 年 9 月 29 日　提交标签：</w:t>
+      </w:r>
+      <w:r>
+        <w:rPr>
+          <w:rFonts w:ascii="Consolas" w:hAnsi="Consolas" w:eastAsia="Consolas"/>
+          <w:b w:val="0"/>
+          <w:color w:val="525E68"/>
+        </w:rPr>
+        <w:t>hospital-pathway-final-2026-09-29-r4</w:t>
+      </w:r>
+      <w:r>
+        <w:rPr>
+          <w:rFonts w:ascii="Microsoft YaHei" w:hAnsi="Microsoft YaHei" w:eastAsia="Microsoft YaHei"/>
+          <w:b w:val="0"/>
+          <w:color w:val="525E68"/>
+        </w:rPr>
+        <w:t>。适用模型：</w:t>
+      </w:r>
+      <w:r>
+        <w:rPr>
+          <w:rFonts w:ascii="Consolas" w:hAnsi="Consolas" w:eastAsia="Consolas"/>
+          <w:b w:val="0"/>
+          <w:color w:val="525E68"/>
+        </w:rPr>
+        <w:t>1-17.bpmn</w:t>
+      </w:r>
+      <w:r>
+        <w:rPr>
+          <w:rFonts w:ascii="Microsoft YaHei" w:hAnsi="Microsoft YaHei" w:eastAsia="Microsoft YaHei"/>
+          <w:b w:val="0"/>
+          <w:color w:val="525E68"/>
+        </w:rPr>
+        <w:t xml:space="preserve">，SHA-256 为 </w:t>
+      </w:r>
+      <w:r>
+        <w:rPr>
+          <w:rFonts w:ascii="Consolas" w:hAnsi="Consolas" w:eastAsia="Consolas"/>
+          <w:b w:val="0"/>
+          <w:color w:val="525E68"/>
+        </w:rPr>
+        <w:t>616af009cf00ec674ef7371d48071f8c015b44c1c65f0cf15bd550dc2e9a960b</w:t>
+      </w:r>
+      <w:r>
+        <w:rPr>
+          <w:rFonts w:ascii="Microsoft YaHei" w:hAnsi="Microsoft YaHei" w:eastAsia="Microsoft YaHei"/>
+          <w:b w:val="0"/>
+          <w:color w:val="525E68"/>
+        </w:rPr>
+        <w:t>。</w:t>
       </w:r>
     </w:p>
     <w:p>
@@ -862,7 +910,7 @@
           <w:rFonts w:ascii="Microsoft YaHei" w:hAnsi="Microsoft YaHei" w:eastAsia="Microsoft YaHei"/>
           <w:b w:val="0"/>
         </w:rPr>
-        <w:t>同时证明指定路径和结果：目标元素进入或被跳过、数据值符合规则、实例达到预期状态，且无未解释的 incident。FEEL 表达式通过仅说明条件本身按给定输入求值正确，不替代 Camunda 中的消息、任务与计时器执行。</w:t>
+        <w:t>同时证明指定路径和结果：目标元素进入或被跳过、数据值符合规则、实例达到预期状态，且无未解释的 incident。一个 AT 编号有多个子场景时，只有全部子场景满足判据，才能把整个 AT 标为通过；已有正向样本而负向尚未执行的，标为“部分”。FEEL 表达式通过仅说明条件本身按给定输入求值正确，不替代 Camunda 中的消息、任务与计时器执行。</w:t>
       </w:r>
     </w:p>
     <w:tbl>
@@ -1021,7 +1069,7 @@
                 <w:color w:val="FFFFFF"/>
                 <w:sz w:val="16"/>
               </w:rPr>
-              <w:t>当前状态</w:t>
+              <w:t>当前判定及证据</w:t>
             </w:r>
           </w:p>
         </w:tc>
@@ -1061,7 +1109,7 @@
                 <w:color w:val="000000"/>
                 <w:sz w:val="16"/>
               </w:rPr>
-              <w:t>AT-01／AT-16 资源完整性 R-01 R-13</w:t>
+              <w:t>AT-01 R-01 R-13</w:t>
             </w:r>
           </w:p>
         </w:tc>
@@ -1095,7 +1143,7 @@
                 <w:color w:val="000000"/>
                 <w:sz w:val="16"/>
               </w:rPr>
-              <w:t>一次部署 BPMN 与全部 Forms；运行覆盖和表单检查。</w:t>
+              <w:t>BPMN 与 Forms 一次部署。</w:t>
             </w:r>
           </w:p>
         </w:tc>
@@ -1129,7 +1177,7 @@
                 <w:color w:val="000000"/>
                 <w:sz w:val="16"/>
               </w:rPr>
-              <w:t>1 个医院定义、16 个 Forms；81／81 个用户任务有绑定；50 种 job type 覆盖 51 个自动步骤；0 模型校验错误。</w:t>
+              <w:t>1 个医院定义、16 个 Forms；0 部署错误。</w:t>
             </w:r>
           </w:p>
         </w:tc>
@@ -1164,7 +1212,7 @@
                 <w:color w:val="000000"/>
                 <w:sz w:val="16"/>
               </w:rPr>
-              <w:t>已有结构与部署证据。</w:t>
+              <w:t>通过；E1。</w:t>
             </w:r>
           </w:p>
         </w:tc>
@@ -1205,7 +1253,7 @@
                 <w:color w:val="000000"/>
                 <w:sz w:val="16"/>
               </w:rPr>
-              <w:t>AT-02 至 AT-04 转诊 BR-01</w:t>
+              <w:t>AT-02 BR-01</w:t>
             </w:r>
           </w:p>
         </w:tc>
@@ -1240,7 +1288,7 @@
                 <w:color w:val="000000"/>
                 <w:sz w:val="16"/>
               </w:rPr>
-              <w:t>完整适宜、缺资料后补齐、不适宜三组独立实例。</w:t>
+              <w:t>完整且适宜的转诊走主路径。</w:t>
             </w:r>
           </w:p>
         </w:tc>
@@ -1275,25 +1323,7 @@
                 <w:color w:val="000000"/>
                 <w:sz w:val="16"/>
               </w:rPr>
-              <w:t xml:space="preserve">主路径到达咨询；缺资料消息按相同 </w:t>
-            </w:r>
-            <w:r>
-              <w:rPr>
-                <w:rFonts w:ascii="Consolas" w:hAnsi="Consolas" w:eastAsia="Consolas"/>
-                <w:b w:val="0"/>
-                <w:color w:val="3D4D5C"/>
-                <w:sz w:val="16"/>
-              </w:rPr>
-              <w:t>referralId</w:t>
-            </w:r>
-            <w:r>
-              <w:rPr>
-                <w:rFonts w:ascii="Microsoft YaHei" w:hAnsi="Microsoft YaHei" w:eastAsia="Microsoft YaHei"/>
-                <w:b w:val="0"/>
-                <w:color w:val="000000"/>
-                <w:sz w:val="16"/>
-              </w:rPr>
-              <w:t xml:space="preserve"> 返回正确实例；不适宜不进入预约／治疗。</w:t>
+              <w:t>到达咨询并完成，最终无活跃任务或 incident。</w:t>
             </w:r>
           </w:p>
         </w:tc>
@@ -1329,7 +1359,7 @@
                 <w:color w:val="000000"/>
                 <w:sz w:val="16"/>
               </w:rPr>
-              <w:t>主路径和两条分支已有实例或集成测试。</w:t>
+              <w:t>已抽样通过；E2。</w:t>
             </w:r>
           </w:p>
         </w:tc>
@@ -1369,7 +1399,7 @@
                 <w:color w:val="000000"/>
                 <w:sz w:val="16"/>
               </w:rPr>
-              <w:t>AT-05 咨询排期 BR-02</w:t>
+              <w:t>AT-03 BR-01</w:t>
             </w:r>
           </w:p>
         </w:tc>
@@ -1403,7 +1433,358 @@
                 <w:color w:val="000000"/>
                 <w:sz w:val="16"/>
               </w:rPr>
-              <w:t xml:space="preserve">可用时接受；无空位可重试；紧急或超出 </w:t>
+              <w:t xml:space="preserve">缺资料后按同一 </w:t>
+            </w:r>
+            <w:r>
+              <w:rPr>
+                <w:rFonts w:ascii="Consolas" w:hAnsi="Consolas" w:eastAsia="Consolas"/>
+                <w:b w:val="0"/>
+                <w:color w:val="3D4D5C"/>
+                <w:sz w:val="16"/>
+              </w:rPr>
+              <w:t>referralId</w:t>
+            </w:r>
+            <w:r>
+              <w:rPr>
+                <w:rFonts w:ascii="Microsoft YaHei" w:hAnsi="Microsoft YaHei" w:eastAsia="Microsoft YaHei"/>
+                <w:b w:val="0"/>
+                <w:color w:val="000000"/>
+                <w:sz w:val="16"/>
+              </w:rPr>
+              <w:t xml:space="preserve"> 返回。</w:t>
+            </w:r>
+          </w:p>
+        </w:tc>
+        <w:tc>
+          <w:tcPr>
+            <w:tcW w:type="dxa" w:w="3312"/>
+            <w:vAlign w:val="center"/>
+            <w:tcBorders>
+              <w:top w:val="single" w:sz="4" w:color="D9D9D9"/>
+              <w:left w:val="single" w:sz="4" w:color="D9D9D9"/>
+              <w:bottom w:val="single" w:sz="4" w:color="D9D9D9"/>
+              <w:right w:val="single" w:sz="4" w:color="D9D9D9"/>
+              <w:insideH w:val="single" w:sz="4" w:color="D9D9D9"/>
+              <w:insideV w:val="single" w:sz="4" w:color="D9D9D9"/>
+            </w:tcBorders>
+            <w:tcMar>
+              <w:top w:w="85" w:type="dxa"/>
+              <w:start w:w="95" w:type="dxa"/>
+              <w:bottom w:w="85" w:type="dxa"/>
+              <w:end w:w="95" w:type="dxa"/>
+            </w:tcMar>
+          </w:tcPr>
+          <w:p>
+            <w:pPr>
+              <w:spacing w:after="0" w:line="259" w:lineRule="auto"/>
+            </w:pPr>
+            <w:r>
+              <w:rPr>
+                <w:rFonts w:ascii="Microsoft YaHei" w:hAnsi="Microsoft YaHei" w:eastAsia="Microsoft YaHei"/>
+                <w:b w:val="0"/>
+                <w:color w:val="000000"/>
+                <w:sz w:val="16"/>
+              </w:rPr>
+              <w:t>正确实例继续审核，无错误消息关联。</w:t>
+            </w:r>
+          </w:p>
+        </w:tc>
+        <w:tc>
+          <w:tcPr>
+            <w:tcW w:type="dxa" w:w="2232"/>
+            <w:vAlign w:val="center"/>
+            <w:tcBorders>
+              <w:top w:val="single" w:sz="4" w:color="D9D9D9"/>
+              <w:left w:val="single" w:sz="4" w:color="D9D9D9"/>
+              <w:bottom w:val="single" w:sz="4" w:color="D9D9D9"/>
+              <w:right w:val="single" w:sz="4" w:color="D9D9D9"/>
+              <w:insideH w:val="single" w:sz="4" w:color="D9D9D9"/>
+              <w:insideV w:val="single" w:sz="4" w:color="D9D9D9"/>
+            </w:tcBorders>
+            <w:tcMar>
+              <w:top w:w="85" w:type="dxa"/>
+              <w:start w:w="95" w:type="dxa"/>
+              <w:bottom w:w="85" w:type="dxa"/>
+              <w:end w:w="95" w:type="dxa"/>
+            </w:tcMar>
+          </w:tcPr>
+          <w:p>
+            <w:pPr>
+              <w:spacing w:after="0" w:line="259" w:lineRule="auto"/>
+              <w:jc w:val="center"/>
+            </w:pPr>
+            <w:r>
+              <w:rPr>
+                <w:rFonts w:ascii="Microsoft YaHei" w:hAnsi="Microsoft YaHei" w:eastAsia="Microsoft YaHei"/>
+                <w:b w:val="0"/>
+                <w:color w:val="000000"/>
+                <w:sz w:val="16"/>
+              </w:rPr>
+              <w:t>集成测试通过；E3。</w:t>
+            </w:r>
+          </w:p>
+        </w:tc>
+      </w:tr>
+      <w:tr>
+        <w:trPr>
+          <w:cantSplit/>
+        </w:trPr>
+        <w:tc>
+          <w:tcPr>
+            <w:tcW w:type="dxa" w:w="1656"/>
+            <w:vAlign w:val="center"/>
+            <w:tcBorders>
+              <w:top w:val="single" w:sz="4" w:color="D9D9D9"/>
+              <w:left w:val="single" w:sz="4" w:color="D9D9D9"/>
+              <w:bottom w:val="single" w:sz="4" w:color="D9D9D9"/>
+              <w:right w:val="single" w:sz="4" w:color="D9D9D9"/>
+              <w:insideH w:val="single" w:sz="4" w:color="D9D9D9"/>
+              <w:insideV w:val="single" w:sz="4" w:color="D9D9D9"/>
+            </w:tcBorders>
+            <w:tcMar>
+              <w:top w:w="85" w:type="dxa"/>
+              <w:start w:w="95" w:type="dxa"/>
+              <w:bottom w:w="85" w:type="dxa"/>
+              <w:end w:w="95" w:type="dxa"/>
+            </w:tcMar>
+            <w:shd w:fill="F3F7FA"/>
+          </w:tcPr>
+          <w:p>
+            <w:pPr>
+              <w:spacing w:after="0" w:line="259" w:lineRule="auto"/>
+              <w:jc w:val="center"/>
+            </w:pPr>
+            <w:r>
+              <w:rPr>
+                <w:rFonts w:ascii="Microsoft YaHei" w:hAnsi="Microsoft YaHei" w:eastAsia="Microsoft YaHei"/>
+                <w:b w:val="0"/>
+                <w:color w:val="000000"/>
+                <w:sz w:val="16"/>
+              </w:rPr>
+              <w:t>AT-04 BR-01</w:t>
+            </w:r>
+          </w:p>
+        </w:tc>
+        <w:tc>
+          <w:tcPr>
+            <w:tcW w:type="dxa" w:w="2736"/>
+            <w:vAlign w:val="center"/>
+            <w:tcBorders>
+              <w:top w:val="single" w:sz="4" w:color="D9D9D9"/>
+              <w:left w:val="single" w:sz="4" w:color="D9D9D9"/>
+              <w:bottom w:val="single" w:sz="4" w:color="D9D9D9"/>
+              <w:right w:val="single" w:sz="4" w:color="D9D9D9"/>
+              <w:insideH w:val="single" w:sz="4" w:color="D9D9D9"/>
+              <w:insideV w:val="single" w:sz="4" w:color="D9D9D9"/>
+            </w:tcBorders>
+            <w:tcMar>
+              <w:top w:w="85" w:type="dxa"/>
+              <w:start w:w="95" w:type="dxa"/>
+              <w:bottom w:w="85" w:type="dxa"/>
+              <w:end w:w="95" w:type="dxa"/>
+            </w:tcMar>
+            <w:shd w:fill="F3F7FA"/>
+          </w:tcPr>
+          <w:p>
+            <w:pPr>
+              <w:spacing w:after="0" w:line="259" w:lineRule="auto"/>
+            </w:pPr>
+            <w:r>
+              <w:rPr>
+                <w:rFonts w:ascii="Consolas" w:hAnsi="Consolas" w:eastAsia="Consolas"/>
+                <w:b w:val="0"/>
+                <w:color w:val="3D4D5C"/>
+                <w:sz w:val="16"/>
+              </w:rPr>
+              <w:t>referralSuitable=false</w:t>
+            </w:r>
+            <w:r>
+              <w:rPr>
+                <w:rFonts w:ascii="Microsoft YaHei" w:hAnsi="Microsoft YaHei" w:eastAsia="Microsoft YaHei"/>
+                <w:b w:val="0"/>
+                <w:color w:val="000000"/>
+                <w:sz w:val="16"/>
+              </w:rPr>
+              <w:t>。</w:t>
+            </w:r>
+          </w:p>
+        </w:tc>
+        <w:tc>
+          <w:tcPr>
+            <w:tcW w:type="dxa" w:w="3312"/>
+            <w:vAlign w:val="center"/>
+            <w:tcBorders>
+              <w:top w:val="single" w:sz="4" w:color="D9D9D9"/>
+              <w:left w:val="single" w:sz="4" w:color="D9D9D9"/>
+              <w:bottom w:val="single" w:sz="4" w:color="D9D9D9"/>
+              <w:right w:val="single" w:sz="4" w:color="D9D9D9"/>
+              <w:insideH w:val="single" w:sz="4" w:color="D9D9D9"/>
+              <w:insideV w:val="single" w:sz="4" w:color="D9D9D9"/>
+            </w:tcBorders>
+            <w:tcMar>
+              <w:top w:w="85" w:type="dxa"/>
+              <w:start w:w="95" w:type="dxa"/>
+              <w:bottom w:w="85" w:type="dxa"/>
+              <w:end w:w="95" w:type="dxa"/>
+            </w:tcMar>
+            <w:shd w:fill="F3F7FA"/>
+          </w:tcPr>
+          <w:p>
+            <w:pPr>
+              <w:spacing w:after="0" w:line="259" w:lineRule="auto"/>
+            </w:pPr>
+            <w:r>
+              <w:rPr>
+                <w:rFonts w:ascii="Microsoft YaHei" w:hAnsi="Microsoft YaHei" w:eastAsia="Microsoft YaHei"/>
+                <w:b w:val="0"/>
+                <w:color w:val="000000"/>
+                <w:sz w:val="16"/>
+              </w:rPr>
+              <w:t>不进入咨询预约，完成拒绝通知路径。</w:t>
+            </w:r>
+          </w:p>
+        </w:tc>
+        <w:tc>
+          <w:tcPr>
+            <w:tcW w:type="dxa" w:w="2232"/>
+            <w:vAlign w:val="center"/>
+            <w:tcBorders>
+              <w:top w:val="single" w:sz="4" w:color="D9D9D9"/>
+              <w:left w:val="single" w:sz="4" w:color="D9D9D9"/>
+              <w:bottom w:val="single" w:sz="4" w:color="D9D9D9"/>
+              <w:right w:val="single" w:sz="4" w:color="D9D9D9"/>
+              <w:insideH w:val="single" w:sz="4" w:color="D9D9D9"/>
+              <w:insideV w:val="single" w:sz="4" w:color="D9D9D9"/>
+            </w:tcBorders>
+            <w:tcMar>
+              <w:top w:w="85" w:type="dxa"/>
+              <w:start w:w="95" w:type="dxa"/>
+              <w:bottom w:w="85" w:type="dxa"/>
+              <w:end w:w="95" w:type="dxa"/>
+            </w:tcMar>
+            <w:shd w:fill="F3F7FA"/>
+          </w:tcPr>
+          <w:p>
+            <w:pPr>
+              <w:spacing w:after="0" w:line="259" w:lineRule="auto"/>
+              <w:jc w:val="center"/>
+            </w:pPr>
+            <w:r>
+              <w:rPr>
+                <w:rFonts w:ascii="Microsoft YaHei" w:hAnsi="Microsoft YaHei" w:eastAsia="Microsoft YaHei"/>
+                <w:b w:val="0"/>
+                <w:color w:val="000000"/>
+                <w:sz w:val="16"/>
+              </w:rPr>
+              <w:t>集成测试通过；E3。</w:t>
+            </w:r>
+          </w:p>
+        </w:tc>
+      </w:tr>
+      <w:tr>
+        <w:trPr>
+          <w:cantSplit/>
+        </w:trPr>
+        <w:tc>
+          <w:tcPr>
+            <w:tcW w:type="dxa" w:w="1656"/>
+            <w:vAlign w:val="center"/>
+            <w:tcBorders>
+              <w:top w:val="single" w:sz="4" w:color="D9D9D9"/>
+              <w:left w:val="single" w:sz="4" w:color="D9D9D9"/>
+              <w:bottom w:val="single" w:sz="4" w:color="D9D9D9"/>
+              <w:right w:val="single" w:sz="4" w:color="D9D9D9"/>
+              <w:insideH w:val="single" w:sz="4" w:color="D9D9D9"/>
+              <w:insideV w:val="single" w:sz="4" w:color="D9D9D9"/>
+            </w:tcBorders>
+            <w:tcMar>
+              <w:top w:w="85" w:type="dxa"/>
+              <w:start w:w="95" w:type="dxa"/>
+              <w:bottom w:w="85" w:type="dxa"/>
+              <w:end w:w="95" w:type="dxa"/>
+            </w:tcMar>
+          </w:tcPr>
+          <w:p>
+            <w:pPr>
+              <w:spacing w:after="0" w:line="259" w:lineRule="auto"/>
+              <w:jc w:val="center"/>
+            </w:pPr>
+            <w:r>
+              <w:rPr>
+                <w:rFonts w:ascii="Microsoft YaHei" w:hAnsi="Microsoft YaHei" w:eastAsia="Microsoft YaHei"/>
+                <w:b w:val="0"/>
+                <w:color w:val="000000"/>
+                <w:sz w:val="16"/>
+              </w:rPr>
+              <w:t>AT-05 BR-02</w:t>
+            </w:r>
+          </w:p>
+        </w:tc>
+        <w:tc>
+          <w:tcPr>
+            <w:tcW w:type="dxa" w:w="2736"/>
+            <w:vAlign w:val="center"/>
+            <w:tcBorders>
+              <w:top w:val="single" w:sz="4" w:color="D9D9D9"/>
+              <w:left w:val="single" w:sz="4" w:color="D9D9D9"/>
+              <w:bottom w:val="single" w:sz="4" w:color="D9D9D9"/>
+              <w:right w:val="single" w:sz="4" w:color="D9D9D9"/>
+              <w:insideH w:val="single" w:sz="4" w:color="D9D9D9"/>
+              <w:insideV w:val="single" w:sz="4" w:color="D9D9D9"/>
+            </w:tcBorders>
+            <w:tcMar>
+              <w:top w:w="85" w:type="dxa"/>
+              <w:start w:w="95" w:type="dxa"/>
+              <w:bottom w:w="85" w:type="dxa"/>
+              <w:end w:w="95" w:type="dxa"/>
+            </w:tcMar>
+          </w:tcPr>
+          <w:p>
+            <w:pPr>
+              <w:spacing w:after="0" w:line="259" w:lineRule="auto"/>
+            </w:pPr>
+            <w:r>
+              <w:rPr>
+                <w:rFonts w:ascii="Microsoft YaHei" w:hAnsi="Microsoft YaHei" w:eastAsia="Microsoft YaHei"/>
+                <w:b w:val="0"/>
+                <w:color w:val="000000"/>
+                <w:sz w:val="16"/>
+              </w:rPr>
+              <w:t>有空位、无空位可重试、紧急／超期。</w:t>
+            </w:r>
+          </w:p>
+        </w:tc>
+        <w:tc>
+          <w:tcPr>
+            <w:tcW w:type="dxa" w:w="3312"/>
+            <w:vAlign w:val="center"/>
+            <w:tcBorders>
+              <w:top w:val="single" w:sz="4" w:color="D9D9D9"/>
+              <w:left w:val="single" w:sz="4" w:color="D9D9D9"/>
+              <w:bottom w:val="single" w:sz="4" w:color="D9D9D9"/>
+              <w:right w:val="single" w:sz="4" w:color="D9D9D9"/>
+              <w:insideH w:val="single" w:sz="4" w:color="D9D9D9"/>
+              <w:insideV w:val="single" w:sz="4" w:color="D9D9D9"/>
+            </w:tcBorders>
+            <w:tcMar>
+              <w:top w:w="85" w:type="dxa"/>
+              <w:start w:w="95" w:type="dxa"/>
+              <w:bottom w:w="85" w:type="dxa"/>
+              <w:end w:w="95" w:type="dxa"/>
+            </w:tcMar>
+          </w:tcPr>
+          <w:p>
+            <w:pPr>
+              <w:spacing w:after="0" w:line="259" w:lineRule="auto"/>
+            </w:pPr>
+            <w:r>
+              <w:rPr>
+                <w:rFonts w:ascii="Microsoft YaHei" w:hAnsi="Microsoft YaHei" w:eastAsia="Microsoft YaHei"/>
+                <w:b w:val="0"/>
+                <w:color w:val="000000"/>
+                <w:sz w:val="16"/>
+              </w:rPr>
+              <w:t xml:space="preserve">重试不越过 </w:t>
             </w:r>
             <w:r>
               <w:rPr>
@@ -1413,6 +1794,289 @@
                 <w:sz w:val="16"/>
               </w:rPr>
               <w:t>requestedReviewBy</w:t>
+            </w:r>
+            <w:r>
+              <w:rPr>
+                <w:rFonts w:ascii="Microsoft YaHei" w:hAnsi="Microsoft YaHei" w:eastAsia="Microsoft YaHei"/>
+                <w:b w:val="0"/>
+                <w:color w:val="000000"/>
+                <w:sz w:val="16"/>
+              </w:rPr>
+              <w:t>；紧急／超期升级。</w:t>
+            </w:r>
+          </w:p>
+        </w:tc>
+        <w:tc>
+          <w:tcPr>
+            <w:tcW w:type="dxa" w:w="2232"/>
+            <w:vAlign w:val="center"/>
+            <w:tcBorders>
+              <w:top w:val="single" w:sz="4" w:color="D9D9D9"/>
+              <w:left w:val="single" w:sz="4" w:color="D9D9D9"/>
+              <w:bottom w:val="single" w:sz="4" w:color="D9D9D9"/>
+              <w:right w:val="single" w:sz="4" w:color="D9D9D9"/>
+              <w:insideH w:val="single" w:sz="4" w:color="D9D9D9"/>
+              <w:insideV w:val="single" w:sz="4" w:color="D9D9D9"/>
+            </w:tcBorders>
+            <w:tcMar>
+              <w:top w:w="85" w:type="dxa"/>
+              <w:start w:w="95" w:type="dxa"/>
+              <w:bottom w:w="85" w:type="dxa"/>
+              <w:end w:w="95" w:type="dxa"/>
+            </w:tcMar>
+          </w:tcPr>
+          <w:p>
+            <w:pPr>
+              <w:spacing w:after="0" w:line="259" w:lineRule="auto"/>
+              <w:jc w:val="center"/>
+            </w:pPr>
+            <w:r>
+              <w:rPr>
+                <w:rFonts w:ascii="Microsoft YaHei" w:hAnsi="Microsoft YaHei" w:eastAsia="Microsoft YaHei"/>
+                <w:b w:val="0"/>
+                <w:color w:val="000000"/>
+                <w:sz w:val="16"/>
+              </w:rPr>
+              <w:t>部分；正向 E2，FEEL E4；负向 token 待测。</w:t>
+            </w:r>
+          </w:p>
+        </w:tc>
+      </w:tr>
+      <w:tr>
+        <w:trPr>
+          <w:cantSplit/>
+        </w:trPr>
+        <w:tc>
+          <w:tcPr>
+            <w:tcW w:type="dxa" w:w="1656"/>
+            <w:vAlign w:val="center"/>
+            <w:tcBorders>
+              <w:top w:val="single" w:sz="4" w:color="D9D9D9"/>
+              <w:left w:val="single" w:sz="4" w:color="D9D9D9"/>
+              <w:bottom w:val="single" w:sz="4" w:color="D9D9D9"/>
+              <w:right w:val="single" w:sz="4" w:color="D9D9D9"/>
+              <w:insideH w:val="single" w:sz="4" w:color="D9D9D9"/>
+              <w:insideV w:val="single" w:sz="4" w:color="D9D9D9"/>
+            </w:tcBorders>
+            <w:tcMar>
+              <w:top w:w="85" w:type="dxa"/>
+              <w:start w:w="95" w:type="dxa"/>
+              <w:bottom w:w="85" w:type="dxa"/>
+              <w:end w:w="95" w:type="dxa"/>
+            </w:tcMar>
+            <w:shd w:fill="F3F7FA"/>
+          </w:tcPr>
+          <w:p>
+            <w:pPr>
+              <w:spacing w:after="0" w:line="259" w:lineRule="auto"/>
+              <w:jc w:val="center"/>
+            </w:pPr>
+            <w:r>
+              <w:rPr>
+                <w:rFonts w:ascii="Microsoft YaHei" w:hAnsi="Microsoft YaHei" w:eastAsia="Microsoft YaHei"/>
+                <w:b w:val="0"/>
+                <w:color w:val="000000"/>
+                <w:sz w:val="16"/>
+              </w:rPr>
+              <w:t>AT-06 BR-03</w:t>
+            </w:r>
+          </w:p>
+        </w:tc>
+        <w:tc>
+          <w:tcPr>
+            <w:tcW w:type="dxa" w:w="2736"/>
+            <w:vAlign w:val="center"/>
+            <w:tcBorders>
+              <w:top w:val="single" w:sz="4" w:color="D9D9D9"/>
+              <w:left w:val="single" w:sz="4" w:color="D9D9D9"/>
+              <w:bottom w:val="single" w:sz="4" w:color="D9D9D9"/>
+              <w:right w:val="single" w:sz="4" w:color="D9D9D9"/>
+              <w:insideH w:val="single" w:sz="4" w:color="D9D9D9"/>
+              <w:insideV w:val="single" w:sz="4" w:color="D9D9D9"/>
+            </w:tcBorders>
+            <w:tcMar>
+              <w:top w:w="85" w:type="dxa"/>
+              <w:start w:w="95" w:type="dxa"/>
+              <w:bottom w:w="85" w:type="dxa"/>
+              <w:end w:w="95" w:type="dxa"/>
+            </w:tcMar>
+            <w:shd w:fill="F3F7FA"/>
+          </w:tcPr>
+          <w:p>
+            <w:pPr>
+              <w:spacing w:after="0" w:line="259" w:lineRule="auto"/>
+            </w:pPr>
+            <w:r>
+              <w:rPr>
+                <w:rFonts w:ascii="Consolas" w:hAnsi="Consolas" w:eastAsia="Consolas"/>
+                <w:b w:val="0"/>
+                <w:color w:val="3D4D5C"/>
+                <w:sz w:val="16"/>
+              </w:rPr>
+              <w:t>informedConsent=false</w:t>
+            </w:r>
+            <w:r>
+              <w:rPr>
+                <w:rFonts w:ascii="Microsoft YaHei" w:hAnsi="Microsoft YaHei" w:eastAsia="Microsoft YaHei"/>
+                <w:b w:val="0"/>
+                <w:color w:val="000000"/>
+                <w:sz w:val="16"/>
+              </w:rPr>
+              <w:t>。</w:t>
+            </w:r>
+          </w:p>
+        </w:tc>
+        <w:tc>
+          <w:tcPr>
+            <w:tcW w:type="dxa" w:w="3312"/>
+            <w:vAlign w:val="center"/>
+            <w:tcBorders>
+              <w:top w:val="single" w:sz="4" w:color="D9D9D9"/>
+              <w:left w:val="single" w:sz="4" w:color="D9D9D9"/>
+              <w:bottom w:val="single" w:sz="4" w:color="D9D9D9"/>
+              <w:right w:val="single" w:sz="4" w:color="D9D9D9"/>
+              <w:insideH w:val="single" w:sz="4" w:color="D9D9D9"/>
+              <w:insideV w:val="single" w:sz="4" w:color="D9D9D9"/>
+            </w:tcBorders>
+            <w:tcMar>
+              <w:top w:w="85" w:type="dxa"/>
+              <w:start w:w="95" w:type="dxa"/>
+              <w:bottom w:w="85" w:type="dxa"/>
+              <w:end w:w="95" w:type="dxa"/>
+            </w:tcMar>
+            <w:shd w:fill="F3F7FA"/>
+          </w:tcPr>
+          <w:p>
+            <w:pPr>
+              <w:spacing w:after="0" w:line="259" w:lineRule="auto"/>
+            </w:pPr>
+            <w:r>
+              <w:rPr>
+                <w:rFonts w:ascii="Microsoft YaHei" w:hAnsi="Microsoft YaHei" w:eastAsia="Microsoft YaHei"/>
+                <w:b w:val="0"/>
+                <w:color w:val="000000"/>
+                <w:sz w:val="16"/>
+              </w:rPr>
+              <w:t>治疗执行元素出现次数为 0。</w:t>
+            </w:r>
+          </w:p>
+        </w:tc>
+        <w:tc>
+          <w:tcPr>
+            <w:tcW w:type="dxa" w:w="2232"/>
+            <w:vAlign w:val="center"/>
+            <w:tcBorders>
+              <w:top w:val="single" w:sz="4" w:color="D9D9D9"/>
+              <w:left w:val="single" w:sz="4" w:color="D9D9D9"/>
+              <w:bottom w:val="single" w:sz="4" w:color="D9D9D9"/>
+              <w:right w:val="single" w:sz="4" w:color="D9D9D9"/>
+              <w:insideH w:val="single" w:sz="4" w:color="D9D9D9"/>
+              <w:insideV w:val="single" w:sz="4" w:color="D9D9D9"/>
+            </w:tcBorders>
+            <w:tcMar>
+              <w:top w:w="85" w:type="dxa"/>
+              <w:start w:w="95" w:type="dxa"/>
+              <w:bottom w:w="85" w:type="dxa"/>
+              <w:end w:w="95" w:type="dxa"/>
+            </w:tcMar>
+            <w:shd w:fill="F3F7FA"/>
+          </w:tcPr>
+          <w:p>
+            <w:pPr>
+              <w:spacing w:after="0" w:line="259" w:lineRule="auto"/>
+              <w:jc w:val="center"/>
+            </w:pPr>
+            <w:r>
+              <w:rPr>
+                <w:rFonts w:ascii="Microsoft YaHei" w:hAnsi="Microsoft YaHei" w:eastAsia="Microsoft YaHei"/>
+                <w:b w:val="0"/>
+                <w:color w:val="000000"/>
+                <w:sz w:val="16"/>
+              </w:rPr>
+              <w:t>部分；同意正向 E2，拒绝待测。</w:t>
+            </w:r>
+          </w:p>
+        </w:tc>
+      </w:tr>
+      <w:tr>
+        <w:trPr>
+          <w:cantSplit/>
+        </w:trPr>
+        <w:tc>
+          <w:tcPr>
+            <w:tcW w:type="dxa" w:w="1656"/>
+            <w:vAlign w:val="center"/>
+            <w:tcBorders>
+              <w:top w:val="single" w:sz="4" w:color="D9D9D9"/>
+              <w:left w:val="single" w:sz="4" w:color="D9D9D9"/>
+              <w:bottom w:val="single" w:sz="4" w:color="D9D9D9"/>
+              <w:right w:val="single" w:sz="4" w:color="D9D9D9"/>
+              <w:insideH w:val="single" w:sz="4" w:color="D9D9D9"/>
+              <w:insideV w:val="single" w:sz="4" w:color="D9D9D9"/>
+            </w:tcBorders>
+            <w:tcMar>
+              <w:top w:w="85" w:type="dxa"/>
+              <w:start w:w="95" w:type="dxa"/>
+              <w:bottom w:w="85" w:type="dxa"/>
+              <w:end w:w="95" w:type="dxa"/>
+            </w:tcMar>
+          </w:tcPr>
+          <w:p>
+            <w:pPr>
+              <w:spacing w:after="0" w:line="259" w:lineRule="auto"/>
+              <w:jc w:val="center"/>
+            </w:pPr>
+            <w:r>
+              <w:rPr>
+                <w:rFonts w:ascii="Microsoft YaHei" w:hAnsi="Microsoft YaHei" w:eastAsia="Microsoft YaHei"/>
+                <w:b w:val="0"/>
+                <w:color w:val="000000"/>
+                <w:sz w:val="16"/>
+              </w:rPr>
+              <w:t>AT-07 BR-04</w:t>
+            </w:r>
+          </w:p>
+        </w:tc>
+        <w:tc>
+          <w:tcPr>
+            <w:tcW w:type="dxa" w:w="2736"/>
+            <w:vAlign w:val="center"/>
+            <w:tcBorders>
+              <w:top w:val="single" w:sz="4" w:color="D9D9D9"/>
+              <w:left w:val="single" w:sz="4" w:color="D9D9D9"/>
+              <w:bottom w:val="single" w:sz="4" w:color="D9D9D9"/>
+              <w:right w:val="single" w:sz="4" w:color="D9D9D9"/>
+              <w:insideH w:val="single" w:sz="4" w:color="D9D9D9"/>
+              <w:insideV w:val="single" w:sz="4" w:color="D9D9D9"/>
+            </w:tcBorders>
+            <w:tcMar>
+              <w:top w:w="85" w:type="dxa"/>
+              <w:start w:w="95" w:type="dxa"/>
+              <w:bottom w:w="85" w:type="dxa"/>
+              <w:end w:w="95" w:type="dxa"/>
+            </w:tcMar>
+          </w:tcPr>
+          <w:p>
+            <w:pPr>
+              <w:spacing w:after="0" w:line="259" w:lineRule="auto"/>
+            </w:pPr>
+            <w:r>
+              <w:rPr>
+                <w:rFonts w:ascii="Microsoft YaHei" w:hAnsi="Microsoft YaHei" w:eastAsia="Microsoft YaHei"/>
+                <w:b w:val="0"/>
+                <w:color w:val="000000"/>
+                <w:sz w:val="16"/>
+              </w:rPr>
+              <w:t xml:space="preserve">服务不可用或 </w:t>
+            </w:r>
+            <w:r>
+              <w:rPr>
+                <w:rFonts w:ascii="Consolas" w:hAnsi="Consolas" w:eastAsia="Consolas"/>
+                <w:b w:val="0"/>
+                <w:color w:val="3D4D5C"/>
+                <w:sz w:val="16"/>
+              </w:rPr>
+              <w:t>fundingAuthorised=false</w:t>
             </w:r>
             <w:r>
               <w:rPr>
@@ -1455,7 +2119,7 @@
                 <w:color w:val="000000"/>
                 <w:sz w:val="16"/>
               </w:rPr>
-              <w:t>可用路径到咨询；重试不越过期限；紧急／超期进入人工升级，不能无限循环。</w:t>
+              <w:t>治疗及未经授权付款出现次数均为 0。</w:t>
             </w:r>
           </w:p>
         </w:tc>
@@ -1490,7 +2154,7 @@
                 <w:color w:val="000000"/>
                 <w:sz w:val="16"/>
               </w:rPr>
-              <w:t>正向已抽样；边界流程待执行。</w:t>
+              <w:t>部分；资助正向 E2，拒绝待测。</w:t>
             </w:r>
           </w:p>
         </w:tc>
@@ -1531,7 +2195,7 @@
                 <w:color w:val="000000"/>
                 <w:sz w:val="16"/>
               </w:rPr>
-              <w:t>AT-06／AT-07 同意与资助 BR-03 BR-04</w:t>
+              <w:t>AT-08 BR-05</w:t>
             </w:r>
           </w:p>
         </w:tc>
@@ -1566,7 +2230,7 @@
                 <w:color w:val="000000"/>
                 <w:sz w:val="16"/>
               </w:rPr>
-              <w:t>拒绝知情同意、服务不可用、资助被拒，分别启动实例。</w:t>
+              <w:t>首次支付与相同付款引用的已有收费。</w:t>
             </w:r>
           </w:p>
         </w:tc>
@@ -1601,7 +2265,7 @@
                 <w:color w:val="000000"/>
                 <w:sz w:val="16"/>
               </w:rPr>
-              <w:t>三种阻断结果均不执行治疗，也不产生未经授权付款；去向和原因可追溯。</w:t>
+              <w:t>每个引用至多产生 1 笔收费。</w:t>
             </w:r>
           </w:p>
         </w:tc>
@@ -1637,7 +2301,7 @@
                 <w:color w:val="000000"/>
                 <w:sz w:val="16"/>
               </w:rPr>
-              <w:t>正向已抽样；负向待执行。</w:t>
+              <w:t>部分；支付正向 E2，重复收费待测。</w:t>
             </w:r>
           </w:p>
         </w:tc>
@@ -1677,7 +2341,7 @@
                 <w:color w:val="000000"/>
                 <w:sz w:val="16"/>
               </w:rPr>
-              <w:t>AT-08 支付 BR-05</w:t>
+              <w:t>AT-09 BR-06</w:t>
             </w:r>
           </w:p>
         </w:tc>
@@ -1711,7 +2375,7 @@
                 <w:color w:val="000000"/>
                 <w:sz w:val="16"/>
               </w:rPr>
-              <w:t>首次支付成功与同一付款引用已有收费记录。</w:t>
+              <w:t>继续与停止／变更冲突。</w:t>
             </w:r>
           </w:p>
         </w:tc>
@@ -1745,7 +2409,7 @@
                 <w:color w:val="000000"/>
                 <w:sz w:val="16"/>
               </w:rPr>
-              <w:t>首次记录 1 笔；重复情况不创建第 2 笔收费。</w:t>
+              <w:t>停止优先且不进入变更；继续进入下一周期。</w:t>
             </w:r>
           </w:p>
         </w:tc>
@@ -1780,7 +2444,7 @@
                 <w:color w:val="000000"/>
                 <w:sz w:val="16"/>
               </w:rPr>
-              <w:t>成功支付已抽样；防重复边界待执行。</w:t>
+              <w:t>部分；停止 E2，规则 E4；token 边界待测。</w:t>
             </w:r>
           </w:p>
         </w:tc>
@@ -1821,7 +2485,7 @@
                 <w:color w:val="000000"/>
                 <w:sz w:val="16"/>
               </w:rPr>
-              <w:t>AT-09／AT-10 治疗决策 BR-06 BR-07</w:t>
+              <w:t>AT-10 BR-07</w:t>
             </w:r>
           </w:p>
         </w:tc>
@@ -1856,7 +2520,7 @@
                 <w:color w:val="000000"/>
                 <w:sz w:val="16"/>
               </w:rPr>
-              <w:t>继续、停止与变更冲突；正式批准的变更影响费用；未批准变更。</w:t>
+              <w:t>已批准且影响费用，与未批准变更。</w:t>
             </w:r>
           </w:p>
         </w:tc>
@@ -1891,7 +2555,7 @@
                 <w:color w:val="000000"/>
                 <w:sz w:val="16"/>
               </w:rPr>
-              <w:t>停止优先；未经批准不实施新方案；涉及费用的已批变更经过资助／费用复核。</w:t>
+              <w:t>已批方案先复核费用；未批方案不实施。</w:t>
             </w:r>
           </w:p>
         </w:tc>
@@ -1927,7 +2591,7 @@
                 <w:color w:val="000000"/>
                 <w:sz w:val="16"/>
               </w:rPr>
-              <w:t>停止与变更分支已抽样；冲突与继续待执行。</w:t>
+              <w:t>抽样两分支通过；E5。</w:t>
             </w:r>
           </w:p>
         </w:tc>
@@ -1967,7 +2631,7 @@
                 <w:color w:val="000000"/>
                 <w:sz w:val="16"/>
               </w:rPr>
-              <w:t>AT-11／AT-12 改期和缺席 BR-08</w:t>
+              <w:t>AT-11 BR-08</w:t>
             </w:r>
           </w:p>
         </w:tc>
@@ -2001,25 +2665,7 @@
                 <w:color w:val="000000"/>
                 <w:sz w:val="16"/>
               </w:rPr>
-              <w:t xml:space="preserve">身份未核实；新日期晚于 </w:t>
-            </w:r>
-            <w:r>
-              <w:rPr>
-                <w:rFonts w:ascii="Consolas" w:hAnsi="Consolas" w:eastAsia="Consolas"/>
-                <w:b w:val="0"/>
-                <w:color w:val="3D4D5C"/>
-                <w:sz w:val="16"/>
-              </w:rPr>
-              <w:t>requestedReviewBy</w:t>
-            </w:r>
-            <w:r>
-              <w:rPr>
-                <w:rFonts w:ascii="Microsoft YaHei" w:hAnsi="Microsoft YaHei" w:eastAsia="Microsoft YaHei"/>
-                <w:b w:val="0"/>
-                <w:color w:val="000000"/>
-                <w:sz w:val="16"/>
-              </w:rPr>
-              <w:t>；14 天内与 14 天外；取消、临床复核、未到诊。</w:t>
+              <w:t>未核实、越期、14 天内及 14 天外改期。</w:t>
             </w:r>
           </w:p>
         </w:tc>
@@ -2053,7 +2699,7 @@
                 <w:color w:val="000000"/>
                 <w:sz w:val="16"/>
               </w:rPr>
-              <w:t>未核实不改约；过期日期不预订；近日期先电话联系；取消／未到诊各有对应结局。</w:t>
+              <w:t>未核实或越期不改约；近日期先电话联系。</w:t>
             </w:r>
           </w:p>
         </w:tc>
@@ -2088,7 +2734,7 @@
                 <w:color w:val="000000"/>
                 <w:sz w:val="16"/>
               </w:rPr>
-              <w:t>未核实及三类取消结果已测；日期／联系边界待执行。</w:t>
+              <w:t>部分；未核实 E3、规则 E4；日期 token 待测。</w:t>
             </w:r>
           </w:p>
         </w:tc>
@@ -2129,7 +2775,7 @@
                 <w:color w:val="000000"/>
                 <w:sz w:val="16"/>
               </w:rPr>
-              <w:t>AT-13 退款或转款 BR-09</w:t>
+              <w:t>AT-12 R-03</w:t>
             </w:r>
           </w:p>
         </w:tc>
@@ -2164,7 +2810,7 @@
                 <w:color w:val="000000"/>
                 <w:sz w:val="16"/>
               </w:rPr>
-              <w:t>已授权退款、转款及未授权退款。</w:t>
+              <w:t>取消重约、临床复核、未到诊。</w:t>
             </w:r>
           </w:p>
         </w:tc>
@@ -2199,7 +2845,7 @@
                 <w:color w:val="000000"/>
                 <w:sz w:val="16"/>
               </w:rPr>
-              <w:t>仅授权退款调用退款路径；转款不触发退款；未授权请求不得发起退款。</w:t>
+              <w:t>三种实例各按不同路径完成且无 incident。</w:t>
             </w:r>
           </w:p>
         </w:tc>
@@ -2235,7 +2881,7 @@
                 <w:color w:val="000000"/>
                 <w:sz w:val="16"/>
               </w:rPr>
-              <w:t>前两项已抽样；未授权流程待执行。</w:t>
+              <w:t>抽样三分支通过；E5。</w:t>
             </w:r>
           </w:p>
         </w:tc>
@@ -2275,7 +2921,7 @@
                 <w:color w:val="000000"/>
                 <w:sz w:val="16"/>
               </w:rPr>
-              <w:t>AT-14 问询与信件 BR-10</w:t>
+              <w:t>AT-13 BR-09</w:t>
             </w:r>
           </w:p>
         </w:tc>
@@ -2309,7 +2955,7 @@
                 <w:color w:val="000000"/>
                 <w:sz w:val="16"/>
               </w:rPr>
-              <w:t>财务问询、已批安全信件、疑似临床错误、逾期提醒、两封并发信件。</w:t>
+              <w:t>授权退款、转款及未授权退款。</w:t>
             </w:r>
           </w:p>
         </w:tc>
@@ -2343,7 +2989,7 @@
                 <w:color w:val="000000"/>
                 <w:sz w:val="16"/>
               </w:rPr>
-              <w:t>问询分派正确；可发布信件需双重条件成立；疑似错误被拦截；计时器与两封信件互不串扰。</w:t>
+              <w:t>仅授权可退款；转款不调用退款。</w:t>
             </w:r>
           </w:p>
         </w:tc>
@@ -2378,7 +3024,7 @@
                 <w:color w:val="000000"/>
                 <w:sz w:val="16"/>
               </w:rPr>
-              <w:t>问询和已完成信件已抽样；错误、计时器、并发待执行。</w:t>
+              <w:t>部分；前两项 E5、规则 E4；未授权 token 待测。</w:t>
             </w:r>
           </w:p>
         </w:tc>
@@ -2419,7 +3065,7 @@
                 <w:color w:val="000000"/>
                 <w:sz w:val="16"/>
               </w:rPr>
-              <w:t>AT-15 访问与中断 BR-11</w:t>
+              <w:t>AT-14 BR-10</w:t>
             </w:r>
           </w:p>
         </w:tc>
@@ -2454,25 +3100,7 @@
                 <w:color w:val="000000"/>
                 <w:sz w:val="16"/>
               </w:rPr>
-              <w:t xml:space="preserve">授权与拒绝访问；用唯一 </w:t>
-            </w:r>
-            <w:r>
-              <w:rPr>
-                <w:rFonts w:ascii="Consolas" w:hAnsi="Consolas" w:eastAsia="Consolas"/>
-                <w:b w:val="0"/>
-                <w:color w:val="3D4D5C"/>
-                <w:sz w:val="16"/>
-              </w:rPr>
-              <w:t>incidentReference</w:t>
-            </w:r>
-            <w:r>
-              <w:rPr>
-                <w:rFonts w:ascii="Microsoft YaHei" w:hAnsi="Microsoft YaHei" w:eastAsia="Microsoft YaHei"/>
-                <w:b w:val="0"/>
-                <w:color w:val="000000"/>
-                <w:sz w:val="16"/>
-              </w:rPr>
-              <w:t xml:space="preserve"> 发布中断和恢复。</w:t>
+              <w:t>财务问询、安全信件、疑似错误、提醒和并发。</w:t>
             </w:r>
           </w:p>
         </w:tc>
@@ -2507,7 +3135,7 @@
                 <w:color w:val="000000"/>
                 <w:sz w:val="16"/>
               </w:rPr>
-              <w:t>拒绝路径不授予权限且完成审计；恢复消息只关联目标实例，最终无未处理任务或 incident。</w:t>
+              <w:t>分类正确；疑似错误不得发布；提醒按模型时间触发且信件不串扰。</w:t>
             </w:r>
           </w:p>
         </w:tc>
@@ -2543,7 +3171,315 @@
                 <w:color w:val="000000"/>
                 <w:sz w:val="16"/>
               </w:rPr>
-              <w:t>授权、拒绝及恢复已测。</w:t>
+              <w:t>部分；问询／完成 E2 E5；计时器与并发待测。</w:t>
+            </w:r>
+          </w:p>
+        </w:tc>
+      </w:tr>
+      <w:tr>
+        <w:trPr>
+          <w:cantSplit/>
+        </w:trPr>
+        <w:tc>
+          <w:tcPr>
+            <w:tcW w:type="dxa" w:w="1656"/>
+            <w:vAlign w:val="center"/>
+            <w:tcBorders>
+              <w:top w:val="single" w:sz="4" w:color="D9D9D9"/>
+              <w:left w:val="single" w:sz="4" w:color="D9D9D9"/>
+              <w:bottom w:val="single" w:sz="4" w:color="D9D9D9"/>
+              <w:right w:val="single" w:sz="4" w:color="D9D9D9"/>
+              <w:insideH w:val="single" w:sz="4" w:color="D9D9D9"/>
+              <w:insideV w:val="single" w:sz="4" w:color="D9D9D9"/>
+            </w:tcBorders>
+            <w:tcMar>
+              <w:top w:w="85" w:type="dxa"/>
+              <w:start w:w="95" w:type="dxa"/>
+              <w:bottom w:w="85" w:type="dxa"/>
+              <w:end w:w="95" w:type="dxa"/>
+            </w:tcMar>
+          </w:tcPr>
+          <w:p>
+            <w:pPr>
+              <w:spacing w:after="0" w:line="259" w:lineRule="auto"/>
+              <w:jc w:val="center"/>
+            </w:pPr>
+            <w:r>
+              <w:rPr>
+                <w:rFonts w:ascii="Microsoft YaHei" w:hAnsi="Microsoft YaHei" w:eastAsia="Microsoft YaHei"/>
+                <w:b w:val="0"/>
+                <w:color w:val="000000"/>
+                <w:sz w:val="16"/>
+              </w:rPr>
+              <w:t>AT-15 BR-11</w:t>
+            </w:r>
+          </w:p>
+        </w:tc>
+        <w:tc>
+          <w:tcPr>
+            <w:tcW w:type="dxa" w:w="2736"/>
+            <w:vAlign w:val="center"/>
+            <w:tcBorders>
+              <w:top w:val="single" w:sz="4" w:color="D9D9D9"/>
+              <w:left w:val="single" w:sz="4" w:color="D9D9D9"/>
+              <w:bottom w:val="single" w:sz="4" w:color="D9D9D9"/>
+              <w:right w:val="single" w:sz="4" w:color="D9D9D9"/>
+              <w:insideH w:val="single" w:sz="4" w:color="D9D9D9"/>
+              <w:insideV w:val="single" w:sz="4" w:color="D9D9D9"/>
+            </w:tcBorders>
+            <w:tcMar>
+              <w:top w:w="85" w:type="dxa"/>
+              <w:start w:w="95" w:type="dxa"/>
+              <w:bottom w:w="85" w:type="dxa"/>
+              <w:end w:w="95" w:type="dxa"/>
+            </w:tcMar>
+          </w:tcPr>
+          <w:p>
+            <w:pPr>
+              <w:spacing w:after="0" w:line="259" w:lineRule="auto"/>
+            </w:pPr>
+            <w:r>
+              <w:rPr>
+                <w:rFonts w:ascii="Microsoft YaHei" w:hAnsi="Microsoft YaHei" w:eastAsia="Microsoft YaHei"/>
+                <w:b w:val="0"/>
+                <w:color w:val="000000"/>
+                <w:sz w:val="16"/>
+              </w:rPr>
+              <w:t xml:space="preserve">授权／拒绝访问及按 </w:t>
+            </w:r>
+            <w:r>
+              <w:rPr>
+                <w:rFonts w:ascii="Consolas" w:hAnsi="Consolas" w:eastAsia="Consolas"/>
+                <w:b w:val="0"/>
+                <w:color w:val="3D4D5C"/>
+                <w:sz w:val="16"/>
+              </w:rPr>
+              <w:t>incidentReference</w:t>
+            </w:r>
+            <w:r>
+              <w:rPr>
+                <w:rFonts w:ascii="Microsoft YaHei" w:hAnsi="Microsoft YaHei" w:eastAsia="Microsoft YaHei"/>
+                <w:b w:val="0"/>
+                <w:color w:val="000000"/>
+                <w:sz w:val="16"/>
+              </w:rPr>
+              <w:t xml:space="preserve"> 恢复。</w:t>
+            </w:r>
+          </w:p>
+        </w:tc>
+        <w:tc>
+          <w:tcPr>
+            <w:tcW w:type="dxa" w:w="3312"/>
+            <w:vAlign w:val="center"/>
+            <w:tcBorders>
+              <w:top w:val="single" w:sz="4" w:color="D9D9D9"/>
+              <w:left w:val="single" w:sz="4" w:color="D9D9D9"/>
+              <w:bottom w:val="single" w:sz="4" w:color="D9D9D9"/>
+              <w:right w:val="single" w:sz="4" w:color="D9D9D9"/>
+              <w:insideH w:val="single" w:sz="4" w:color="D9D9D9"/>
+              <w:insideV w:val="single" w:sz="4" w:color="D9D9D9"/>
+            </w:tcBorders>
+            <w:tcMar>
+              <w:top w:w="85" w:type="dxa"/>
+              <w:start w:w="95" w:type="dxa"/>
+              <w:bottom w:w="85" w:type="dxa"/>
+              <w:end w:w="95" w:type="dxa"/>
+            </w:tcMar>
+          </w:tcPr>
+          <w:p>
+            <w:pPr>
+              <w:spacing w:after="0" w:line="259" w:lineRule="auto"/>
+            </w:pPr>
+            <w:r>
+              <w:rPr>
+                <w:rFonts w:ascii="Microsoft YaHei" w:hAnsi="Microsoft YaHei" w:eastAsia="Microsoft YaHei"/>
+                <w:b w:val="0"/>
+                <w:color w:val="000000"/>
+                <w:sz w:val="16"/>
+              </w:rPr>
+              <w:t>拒绝不授予权限；恢复只关联目标实例，最终无 incident。</w:t>
+            </w:r>
+          </w:p>
+        </w:tc>
+        <w:tc>
+          <w:tcPr>
+            <w:tcW w:type="dxa" w:w="2232"/>
+            <w:vAlign w:val="center"/>
+            <w:tcBorders>
+              <w:top w:val="single" w:sz="4" w:color="D9D9D9"/>
+              <w:left w:val="single" w:sz="4" w:color="D9D9D9"/>
+              <w:bottom w:val="single" w:sz="4" w:color="D9D9D9"/>
+              <w:right w:val="single" w:sz="4" w:color="D9D9D9"/>
+              <w:insideH w:val="single" w:sz="4" w:color="D9D9D9"/>
+              <w:insideV w:val="single" w:sz="4" w:color="D9D9D9"/>
+            </w:tcBorders>
+            <w:tcMar>
+              <w:top w:w="85" w:type="dxa"/>
+              <w:start w:w="95" w:type="dxa"/>
+              <w:bottom w:w="85" w:type="dxa"/>
+              <w:end w:w="95" w:type="dxa"/>
+            </w:tcMar>
+          </w:tcPr>
+          <w:p>
+            <w:pPr>
+              <w:spacing w:after="0" w:line="259" w:lineRule="auto"/>
+              <w:jc w:val="center"/>
+            </w:pPr>
+            <w:r>
+              <w:rPr>
+                <w:rFonts w:ascii="Microsoft YaHei" w:hAnsi="Microsoft YaHei" w:eastAsia="Microsoft YaHei"/>
+                <w:b w:val="0"/>
+                <w:color w:val="000000"/>
+                <w:sz w:val="16"/>
+              </w:rPr>
+              <w:t>现有子场景通过；E3 E5。</w:t>
+            </w:r>
+          </w:p>
+        </w:tc>
+      </w:tr>
+      <w:tr>
+        <w:trPr>
+          <w:cantSplit/>
+        </w:trPr>
+        <w:tc>
+          <w:tcPr>
+            <w:tcW w:type="dxa" w:w="1656"/>
+            <w:vAlign w:val="center"/>
+            <w:tcBorders>
+              <w:top w:val="single" w:sz="4" w:color="D9D9D9"/>
+              <w:left w:val="single" w:sz="4" w:color="D9D9D9"/>
+              <w:bottom w:val="single" w:sz="4" w:color="D9D9D9"/>
+              <w:right w:val="single" w:sz="4" w:color="D9D9D9"/>
+              <w:insideH w:val="single" w:sz="4" w:color="D9D9D9"/>
+              <w:insideV w:val="single" w:sz="4" w:color="D9D9D9"/>
+            </w:tcBorders>
+            <w:tcMar>
+              <w:top w:w="85" w:type="dxa"/>
+              <w:start w:w="95" w:type="dxa"/>
+              <w:bottom w:w="85" w:type="dxa"/>
+              <w:end w:w="95" w:type="dxa"/>
+            </w:tcMar>
+            <w:shd w:fill="F3F7FA"/>
+          </w:tcPr>
+          <w:p>
+            <w:pPr>
+              <w:spacing w:after="0" w:line="259" w:lineRule="auto"/>
+              <w:jc w:val="center"/>
+            </w:pPr>
+            <w:r>
+              <w:rPr>
+                <w:rFonts w:ascii="Microsoft YaHei" w:hAnsi="Microsoft YaHei" w:eastAsia="Microsoft YaHei"/>
+                <w:b w:val="0"/>
+                <w:color w:val="000000"/>
+                <w:sz w:val="16"/>
+              </w:rPr>
+              <w:t>AT-16 R-13</w:t>
+            </w:r>
+          </w:p>
+        </w:tc>
+        <w:tc>
+          <w:tcPr>
+            <w:tcW w:type="dxa" w:w="2736"/>
+            <w:vAlign w:val="center"/>
+            <w:tcBorders>
+              <w:top w:val="single" w:sz="4" w:color="D9D9D9"/>
+              <w:left w:val="single" w:sz="4" w:color="D9D9D9"/>
+              <w:bottom w:val="single" w:sz="4" w:color="D9D9D9"/>
+              <w:right w:val="single" w:sz="4" w:color="D9D9D9"/>
+              <w:insideH w:val="single" w:sz="4" w:color="D9D9D9"/>
+              <w:insideV w:val="single" w:sz="4" w:color="D9D9D9"/>
+            </w:tcBorders>
+            <w:tcMar>
+              <w:top w:w="85" w:type="dxa"/>
+              <w:start w:w="95" w:type="dxa"/>
+              <w:bottom w:w="85" w:type="dxa"/>
+              <w:end w:w="95" w:type="dxa"/>
+            </w:tcMar>
+            <w:shd w:fill="F3F7FA"/>
+          </w:tcPr>
+          <w:p>
+            <w:pPr>
+              <w:spacing w:after="0" w:line="259" w:lineRule="auto"/>
+            </w:pPr>
+            <w:r>
+              <w:rPr>
+                <w:rFonts w:ascii="Microsoft YaHei" w:hAnsi="Microsoft YaHei" w:eastAsia="Microsoft YaHei"/>
+                <w:b w:val="0"/>
+                <w:color w:val="000000"/>
+                <w:sz w:val="16"/>
+              </w:rPr>
+              <w:t>表单绑定、渲染和 Worker 覆盖检查。</w:t>
+            </w:r>
+          </w:p>
+        </w:tc>
+        <w:tc>
+          <w:tcPr>
+            <w:tcW w:type="dxa" w:w="3312"/>
+            <w:vAlign w:val="center"/>
+            <w:tcBorders>
+              <w:top w:val="single" w:sz="4" w:color="D9D9D9"/>
+              <w:left w:val="single" w:sz="4" w:color="D9D9D9"/>
+              <w:bottom w:val="single" w:sz="4" w:color="D9D9D9"/>
+              <w:right w:val="single" w:sz="4" w:color="D9D9D9"/>
+              <w:insideH w:val="single" w:sz="4" w:color="D9D9D9"/>
+              <w:insideV w:val="single" w:sz="4" w:color="D9D9D9"/>
+            </w:tcBorders>
+            <w:tcMar>
+              <w:top w:w="85" w:type="dxa"/>
+              <w:start w:w="95" w:type="dxa"/>
+              <w:bottom w:w="85" w:type="dxa"/>
+              <w:end w:w="95" w:type="dxa"/>
+            </w:tcMar>
+            <w:shd w:fill="F3F7FA"/>
+          </w:tcPr>
+          <w:p>
+            <w:pPr>
+              <w:spacing w:after="0" w:line="259" w:lineRule="auto"/>
+            </w:pPr>
+            <w:r>
+              <w:rPr>
+                <w:rFonts w:ascii="Microsoft YaHei" w:hAnsi="Microsoft YaHei" w:eastAsia="Microsoft YaHei"/>
+                <w:b w:val="0"/>
+                <w:color w:val="000000"/>
+                <w:sz w:val="16"/>
+              </w:rPr>
+              <w:t>81／81 任务、50 种 job type、51 个自动步骤全部覆盖。</w:t>
+            </w:r>
+          </w:p>
+        </w:tc>
+        <w:tc>
+          <w:tcPr>
+            <w:tcW w:type="dxa" w:w="2232"/>
+            <w:vAlign w:val="center"/>
+            <w:tcBorders>
+              <w:top w:val="single" w:sz="4" w:color="D9D9D9"/>
+              <w:left w:val="single" w:sz="4" w:color="D9D9D9"/>
+              <w:bottom w:val="single" w:sz="4" w:color="D9D9D9"/>
+              <w:right w:val="single" w:sz="4" w:color="D9D9D9"/>
+              <w:insideH w:val="single" w:sz="4" w:color="D9D9D9"/>
+              <w:insideV w:val="single" w:sz="4" w:color="D9D9D9"/>
+            </w:tcBorders>
+            <w:tcMar>
+              <w:top w:w="85" w:type="dxa"/>
+              <w:start w:w="95" w:type="dxa"/>
+              <w:bottom w:w="85" w:type="dxa"/>
+              <w:end w:w="95" w:type="dxa"/>
+            </w:tcMar>
+            <w:shd w:fill="F3F7FA"/>
+          </w:tcPr>
+          <w:p>
+            <w:pPr>
+              <w:spacing w:after="0" w:line="259" w:lineRule="auto"/>
+              <w:jc w:val="center"/>
+            </w:pPr>
+            <w:r>
+              <w:rPr>
+                <w:rFonts w:ascii="Microsoft YaHei" w:hAnsi="Microsoft YaHei" w:eastAsia="Microsoft YaHei"/>
+                <w:b w:val="0"/>
+                <w:color w:val="000000"/>
+                <w:sz w:val="16"/>
+              </w:rPr>
+              <w:t>结构检查通过；E1 E3。</w:t>
             </w:r>
           </w:p>
         </w:tc>
@@ -2553,6 +3489,121 @@
       <w:pPr>
         <w:spacing w:after="40"/>
       </w:pPr>
+    </w:p>
+    <w:p>
+      <w:pPr/>
+      <w:r>
+        <w:rPr>
+          <w:rFonts w:ascii="Microsoft YaHei" w:hAnsi="Microsoft YaHei" w:eastAsia="Microsoft YaHei"/>
+          <w:b w:val="0"/>
+        </w:rPr>
+        <w:t xml:space="preserve">证据索引：E1 为 </w:t>
+      </w:r>
+      <w:r>
+        <w:rPr>
+          <w:rFonts w:ascii="Consolas" w:hAnsi="Consolas" w:eastAsia="Consolas"/>
+          <w:b w:val="0"/>
+          <w:color w:val="3D4D5C"/>
+        </w:rPr>
+        <w:t>evidence/runtime/deployment-v4-black-style.json</w:t>
+      </w:r>
+      <w:r>
+        <w:rPr>
+          <w:rFonts w:ascii="Microsoft YaHei" w:hAnsi="Microsoft YaHei" w:eastAsia="Microsoft YaHei"/>
+          <w:b w:val="0"/>
+        </w:rPr>
+        <w:t>、</w:t>
+      </w:r>
+      <w:r>
+        <w:rPr>
+          <w:rFonts w:ascii="Consolas" w:hAnsi="Consolas" w:eastAsia="Consolas"/>
+          <w:b w:val="0"/>
+          <w:color w:val="3D4D5C"/>
+        </w:rPr>
+        <w:t>evidence/validation/form-mapping-audit.json</w:t>
+      </w:r>
+      <w:r>
+        <w:rPr>
+          <w:rFonts w:ascii="Microsoft YaHei" w:hAnsi="Microsoft YaHei" w:eastAsia="Microsoft YaHei"/>
+          <w:b w:val="0"/>
+        </w:rPr>
+        <w:t xml:space="preserve"> 和 </w:t>
+      </w:r>
+      <w:r>
+        <w:rPr>
+          <w:rFonts w:ascii="Consolas" w:hAnsi="Consolas" w:eastAsia="Consolas"/>
+          <w:b w:val="0"/>
+          <w:color w:val="3D4D5C"/>
+        </w:rPr>
+        <w:t>form-browser-check.json</w:t>
+      </w:r>
+      <w:r>
+        <w:rPr>
+          <w:rFonts w:ascii="Microsoft YaHei" w:hAnsi="Microsoft YaHei" w:eastAsia="Microsoft YaHei"/>
+          <w:b w:val="0"/>
+        </w:rPr>
+        <w:t xml:space="preserve">；E2 为主路径实例 </w:t>
+      </w:r>
+      <w:r>
+        <w:rPr>
+          <w:rFonts w:ascii="Consolas" w:hAnsi="Consolas" w:eastAsia="Consolas"/>
+          <w:b w:val="0"/>
+          <w:color w:val="3D4D5C"/>
+        </w:rPr>
+        <w:t>evidence/runtime/2251799813799469-status.json</w:t>
+      </w:r>
+      <w:r>
+        <w:rPr>
+          <w:rFonts w:ascii="Microsoft YaHei" w:hAnsi="Microsoft YaHei" w:eastAsia="Microsoft YaHei"/>
+          <w:b w:val="0"/>
+        </w:rPr>
+        <w:t xml:space="preserve"> 及同编号事件／轨迹文件；E3 为 </w:t>
+      </w:r>
+      <w:r>
+        <w:rPr>
+          <w:rFonts w:ascii="Consolas" w:hAnsi="Consolas" w:eastAsia="Consolas"/>
+          <w:b w:val="0"/>
+          <w:color w:val="3D4D5C"/>
+        </w:rPr>
+        <w:t>evidence/tests/maven-evidence-closure-2026-09-29.log</w:t>
+      </w:r>
+      <w:r>
+        <w:rPr>
+          <w:rFonts w:ascii="Microsoft YaHei" w:hAnsi="Microsoft YaHei" w:eastAsia="Microsoft YaHei"/>
+          <w:b w:val="0"/>
+        </w:rPr>
+        <w:t xml:space="preserve">、五份 Surefire XML 与文本摘要；E4 为 </w:t>
+      </w:r>
+      <w:r>
+        <w:rPr>
+          <w:rFonts w:ascii="Consolas" w:hAnsi="Consolas" w:eastAsia="Consolas"/>
+          <w:b w:val="0"/>
+          <w:color w:val="3D4D5C"/>
+        </w:rPr>
+        <w:t>evidence/validation/feel-run-manifest.json</w:t>
+      </w:r>
+      <w:r>
+        <w:rPr>
+          <w:rFonts w:ascii="Microsoft YaHei" w:hAnsi="Microsoft YaHei" w:eastAsia="Microsoft YaHei"/>
+          <w:b w:val="0"/>
+        </w:rPr>
+        <w:t xml:space="preserve"> 及其列明的 53 个规则用例结果；E5 为 </w:t>
+      </w:r>
+      <w:r>
+        <w:rPr>
+          <w:rFonts w:ascii="Consolas" w:hAnsi="Consolas" w:eastAsia="Consolas"/>
+          <w:b w:val="0"/>
+          <w:color w:val="3D4D5C"/>
+        </w:rPr>
+        <w:t>submission/TEST_RESULTS.md</w:t>
+      </w:r>
+      <w:r>
+        <w:rPr>
+          <w:rFonts w:ascii="Microsoft YaHei" w:hAnsi="Microsoft YaHei" w:eastAsia="Microsoft YaHei"/>
+          <w:b w:val="0"/>
+        </w:rPr>
+        <w:t xml:space="preserve"> 第 3 节列出的分支实例及同编号事件／轨迹文件。E4 仅是规则层证据。</w:t>
+      </w:r>
     </w:p>
     <w:p>
       <w:pPr/>
@@ -2569,7 +3620,7 @@
           <w:rFonts w:ascii="Microsoft YaHei" w:hAnsi="Microsoft YaHei" w:eastAsia="Microsoft YaHei"/>
           <w:b w:val="0"/>
         </w:rPr>
-        <w:t xml:space="preserve"> 为上述各 AT 编号提供完整的前置条件、测试数据、操作步骤及 Pass／Fail 条件；本表不代替逐例执行记录。</w:t>
+        <w:t xml:space="preserve"> 为每个 AT 编号提供完整的前置条件、测试数据、操作步骤及 Pass／Fail 条件；本表与证据索引便于定位，不代替逐例执行记录。</w:t>
       </w:r>
     </w:p>
     <w:p>
@@ -2848,7 +3899,7 @@
           <w:rFonts w:ascii="Microsoft YaHei" w:hAnsi="Microsoft YaHei" w:eastAsia="Microsoft YaHei"/>
           <w:b w:val="0"/>
         </w:rPr>
-        <w:t>：模型、Workers、Forms、计划、结果与证据可从同一公开 Git 标签取得；实际执行与待执行场景分开标注；现有可重复测试全部通过，未解释的阻塞 incident 为 0。</w:t>
+        <w:t>：模型、Workers、Forms、计划、结果与证据可从同一公开 Git 标签取得；实际执行与待执行场景分开标注；目标版本重跑的 28 项 Java 测试全部通过，已归档实例无未解释的阻塞 incident。</w:t>
       </w:r>
       <w:r>
         <w:rPr>
@@ -3643,328 +4694,6 @@
         <w:spacing w:after="40"/>
       </w:pPr>
     </w:p>
-    <w:p>
-      <w:pPr>
-        <w:pStyle w:val="Heading1"/>
-      </w:pPr>
-      <w:r>
-        <w:rPr>
-          <w:rFonts w:ascii="Microsoft YaHei" w:hAnsi="Microsoft YaHei" w:eastAsia="Microsoft YaHei"/>
-          <w:b w:val="0"/>
-        </w:rPr>
-        <w:t>八 修订记录</w:t>
-      </w:r>
-    </w:p>
-    <w:tbl>
-      <w:tblPr>
-        <w:tblStyle w:val="TableGrid"/>
-        <w:tblW w:type="auto" w:w="0"/>
-        <w:tblLayout w:type="fixed"/>
-        <w:tblLook w:firstColumn="1" w:firstRow="1" w:lastColumn="0" w:lastRow="0" w:noHBand="0" w:noVBand="1" w:val="04A0"/>
-      </w:tblPr>
-      <w:tblGrid>
-        <w:gridCol w:w="2498"/>
-        <w:gridCol w:w="2498"/>
-        <w:gridCol w:w="2498"/>
-        <w:gridCol w:w="2498"/>
-      </w:tblGrid>
-      <w:tr>
-        <w:trPr>
-          <w:tblHeader/>
-          <w:cantSplit/>
-        </w:trPr>
-        <w:tc>
-          <w:tcPr>
-            <w:tcW w:type="dxa" w:w="936"/>
-            <w:vAlign w:val="center"/>
-            <w:tcBorders>
-              <w:top w:val="single" w:sz="4" w:color="D9D9D9"/>
-              <w:left w:val="single" w:sz="4" w:color="D9D9D9"/>
-              <w:bottom w:val="single" w:sz="4" w:color="D9D9D9"/>
-              <w:right w:val="single" w:sz="4" w:color="D9D9D9"/>
-              <w:insideH w:val="single" w:sz="4" w:color="D9D9D9"/>
-              <w:insideV w:val="single" w:sz="4" w:color="D9D9D9"/>
-            </w:tcBorders>
-            <w:tcMar>
-              <w:top w:w="85" w:type="dxa"/>
-              <w:start w:w="95" w:type="dxa"/>
-              <w:bottom w:w="85" w:type="dxa"/>
-              <w:end w:w="95" w:type="dxa"/>
-            </w:tcMar>
-            <w:shd w:fill="24435B"/>
-          </w:tcPr>
-          <w:p>
-            <w:pPr>
-              <w:spacing w:after="0" w:line="259" w:lineRule="auto"/>
-              <w:jc w:val="left"/>
-            </w:pPr>
-            <w:r>
-              <w:rPr>
-                <w:rFonts w:ascii="Microsoft YaHei" w:hAnsi="Microsoft YaHei" w:eastAsia="Microsoft YaHei"/>
-                <w:b/>
-                <w:color w:val="FFFFFF"/>
-                <w:sz w:val="16"/>
-              </w:rPr>
-              <w:t>版本</w:t>
-            </w:r>
-          </w:p>
-        </w:tc>
-        <w:tc>
-          <w:tcPr>
-            <w:tcW w:type="dxa" w:w="1512"/>
-            <w:vAlign w:val="center"/>
-            <w:tcBorders>
-              <w:top w:val="single" w:sz="4" w:color="D9D9D9"/>
-              <w:left w:val="single" w:sz="4" w:color="D9D9D9"/>
-              <w:bottom w:val="single" w:sz="4" w:color="D9D9D9"/>
-              <w:right w:val="single" w:sz="4" w:color="D9D9D9"/>
-              <w:insideH w:val="single" w:sz="4" w:color="D9D9D9"/>
-              <w:insideV w:val="single" w:sz="4" w:color="D9D9D9"/>
-            </w:tcBorders>
-            <w:tcMar>
-              <w:top w:w="85" w:type="dxa"/>
-              <w:start w:w="95" w:type="dxa"/>
-              <w:bottom w:w="85" w:type="dxa"/>
-              <w:end w:w="95" w:type="dxa"/>
-            </w:tcMar>
-            <w:shd w:fill="24435B"/>
-          </w:tcPr>
-          <w:p>
-            <w:pPr>
-              <w:spacing w:after="0" w:line="259" w:lineRule="auto"/>
-            </w:pPr>
-            <w:r>
-              <w:rPr>
-                <w:rFonts w:ascii="Microsoft YaHei" w:hAnsi="Microsoft YaHei" w:eastAsia="Microsoft YaHei"/>
-                <w:b/>
-                <w:color w:val="FFFFFF"/>
-                <w:sz w:val="16"/>
-              </w:rPr>
-              <w:t>日期</w:t>
-            </w:r>
-          </w:p>
-        </w:tc>
-        <w:tc>
-          <w:tcPr>
-            <w:tcW w:type="dxa" w:w="5472"/>
-            <w:vAlign w:val="center"/>
-            <w:tcBorders>
-              <w:top w:val="single" w:sz="4" w:color="D9D9D9"/>
-              <w:left w:val="single" w:sz="4" w:color="D9D9D9"/>
-              <w:bottom w:val="single" w:sz="4" w:color="D9D9D9"/>
-              <w:right w:val="single" w:sz="4" w:color="D9D9D9"/>
-              <w:insideH w:val="single" w:sz="4" w:color="D9D9D9"/>
-              <w:insideV w:val="single" w:sz="4" w:color="D9D9D9"/>
-            </w:tcBorders>
-            <w:tcMar>
-              <w:top w:w="85" w:type="dxa"/>
-              <w:start w:w="95" w:type="dxa"/>
-              <w:bottom w:w="85" w:type="dxa"/>
-              <w:end w:w="95" w:type="dxa"/>
-            </w:tcMar>
-            <w:shd w:fill="24435B"/>
-          </w:tcPr>
-          <w:p>
-            <w:pPr>
-              <w:spacing w:after="0" w:line="259" w:lineRule="auto"/>
-            </w:pPr>
-            <w:r>
-              <w:rPr>
-                <w:rFonts w:ascii="Microsoft YaHei" w:hAnsi="Microsoft YaHei" w:eastAsia="Microsoft YaHei"/>
-                <w:b/>
-                <w:color w:val="FFFFFF"/>
-                <w:sz w:val="16"/>
-              </w:rPr>
-              <w:t>变更</w:t>
-            </w:r>
-          </w:p>
-        </w:tc>
-        <w:tc>
-          <w:tcPr>
-            <w:tcW w:type="dxa" w:w="2016"/>
-            <w:vAlign w:val="center"/>
-            <w:tcBorders>
-              <w:top w:val="single" w:sz="4" w:color="D9D9D9"/>
-              <w:left w:val="single" w:sz="4" w:color="D9D9D9"/>
-              <w:bottom w:val="single" w:sz="4" w:color="D9D9D9"/>
-              <w:right w:val="single" w:sz="4" w:color="D9D9D9"/>
-              <w:insideH w:val="single" w:sz="4" w:color="D9D9D9"/>
-              <w:insideV w:val="single" w:sz="4" w:color="D9D9D9"/>
-            </w:tcBorders>
-            <w:tcMar>
-              <w:top w:w="85" w:type="dxa"/>
-              <w:start w:w="95" w:type="dxa"/>
-              <w:bottom w:w="85" w:type="dxa"/>
-              <w:end w:w="95" w:type="dxa"/>
-            </w:tcMar>
-            <w:shd w:fill="24435B"/>
-          </w:tcPr>
-          <w:p>
-            <w:pPr>
-              <w:spacing w:after="0" w:line="259" w:lineRule="auto"/>
-              <w:jc w:val="left"/>
-            </w:pPr>
-            <w:r>
-              <w:rPr>
-                <w:rFonts w:ascii="Microsoft YaHei" w:hAnsi="Microsoft YaHei" w:eastAsia="Microsoft YaHei"/>
-                <w:b/>
-                <w:color w:val="FFFFFF"/>
-                <w:sz w:val="16"/>
-              </w:rPr>
-              <w:t>责任信息</w:t>
-            </w:r>
-          </w:p>
-        </w:tc>
-      </w:tr>
-      <w:tr>
-        <w:trPr>
-          <w:cantSplit/>
-        </w:trPr>
-        <w:tc>
-          <w:tcPr>
-            <w:tcW w:type="dxa" w:w="936"/>
-            <w:vAlign w:val="center"/>
-            <w:tcBorders>
-              <w:top w:val="single" w:sz="4" w:color="D9D9D9"/>
-              <w:left w:val="single" w:sz="4" w:color="D9D9D9"/>
-              <w:bottom w:val="single" w:sz="4" w:color="D9D9D9"/>
-              <w:right w:val="single" w:sz="4" w:color="D9D9D9"/>
-              <w:insideH w:val="single" w:sz="4" w:color="D9D9D9"/>
-              <w:insideV w:val="single" w:sz="4" w:color="D9D9D9"/>
-            </w:tcBorders>
-            <w:tcMar>
-              <w:top w:w="85" w:type="dxa"/>
-              <w:start w:w="95" w:type="dxa"/>
-              <w:bottom w:w="85" w:type="dxa"/>
-              <w:end w:w="95" w:type="dxa"/>
-            </w:tcMar>
-          </w:tcPr>
-          <w:p>
-            <w:pPr>
-              <w:spacing w:after="0" w:line="259" w:lineRule="auto"/>
-              <w:jc w:val="center"/>
-            </w:pPr>
-            <w:r>
-              <w:rPr>
-                <w:rFonts w:ascii="Microsoft YaHei" w:hAnsi="Microsoft YaHei" w:eastAsia="Microsoft YaHei"/>
-                <w:b w:val="0"/>
-                <w:color w:val="000000"/>
-                <w:sz w:val="16"/>
-              </w:rPr>
-              <w:t>V1.0</w:t>
-            </w:r>
-          </w:p>
-        </w:tc>
-        <w:tc>
-          <w:tcPr>
-            <w:tcW w:type="dxa" w:w="1512"/>
-            <w:vAlign w:val="center"/>
-            <w:tcBorders>
-              <w:top w:val="single" w:sz="4" w:color="D9D9D9"/>
-              <w:left w:val="single" w:sz="4" w:color="D9D9D9"/>
-              <w:bottom w:val="single" w:sz="4" w:color="D9D9D9"/>
-              <w:right w:val="single" w:sz="4" w:color="D9D9D9"/>
-              <w:insideH w:val="single" w:sz="4" w:color="D9D9D9"/>
-              <w:insideV w:val="single" w:sz="4" w:color="D9D9D9"/>
-            </w:tcBorders>
-            <w:tcMar>
-              <w:top w:w="85" w:type="dxa"/>
-              <w:start w:w="95" w:type="dxa"/>
-              <w:bottom w:w="85" w:type="dxa"/>
-              <w:end w:w="95" w:type="dxa"/>
-            </w:tcMar>
-          </w:tcPr>
-          <w:p>
-            <w:pPr>
-              <w:spacing w:after="0" w:line="259" w:lineRule="auto"/>
-            </w:pPr>
-            <w:r>
-              <w:rPr>
-                <w:rFonts w:ascii="Microsoft YaHei" w:hAnsi="Microsoft YaHei" w:eastAsia="Microsoft YaHei"/>
-                <w:b w:val="0"/>
-                <w:color w:val="000000"/>
-                <w:sz w:val="16"/>
-              </w:rPr>
-              <w:t>2026-09-29</w:t>
-            </w:r>
-          </w:p>
-        </w:tc>
-        <w:tc>
-          <w:tcPr>
-            <w:tcW w:type="dxa" w:w="5472"/>
-            <w:vAlign w:val="center"/>
-            <w:tcBorders>
-              <w:top w:val="single" w:sz="4" w:color="D9D9D9"/>
-              <w:left w:val="single" w:sz="4" w:color="D9D9D9"/>
-              <w:bottom w:val="single" w:sz="4" w:color="D9D9D9"/>
-              <w:right w:val="single" w:sz="4" w:color="D9D9D9"/>
-              <w:insideH w:val="single" w:sz="4" w:color="D9D9D9"/>
-              <w:insideV w:val="single" w:sz="4" w:color="D9D9D9"/>
-            </w:tcBorders>
-            <w:tcMar>
-              <w:top w:w="85" w:type="dxa"/>
-              <w:start w:w="95" w:type="dxa"/>
-              <w:bottom w:w="85" w:type="dxa"/>
-              <w:end w:w="95" w:type="dxa"/>
-            </w:tcMar>
-          </w:tcPr>
-          <w:p>
-            <w:pPr>
-              <w:spacing w:after="0" w:line="259" w:lineRule="auto"/>
-            </w:pPr>
-            <w:r>
-              <w:rPr>
-                <w:rFonts w:ascii="Microsoft YaHei" w:hAnsi="Microsoft YaHei" w:eastAsia="Microsoft YaHei"/>
-                <w:b w:val="0"/>
-                <w:color w:val="000000"/>
-                <w:sz w:val="16"/>
-              </w:rPr>
-              <w:t>根据当前 BPMN、验收场景与已归档结果编制项目专用测试计划。</w:t>
-            </w:r>
-          </w:p>
-        </w:tc>
-        <w:tc>
-          <w:tcPr>
-            <w:tcW w:type="dxa" w:w="2016"/>
-            <w:vAlign w:val="center"/>
-            <w:tcBorders>
-              <w:top w:val="single" w:sz="4" w:color="D9D9D9"/>
-              <w:left w:val="single" w:sz="4" w:color="D9D9D9"/>
-              <w:bottom w:val="single" w:sz="4" w:color="D9D9D9"/>
-              <w:right w:val="single" w:sz="4" w:color="D9D9D9"/>
-              <w:insideH w:val="single" w:sz="4" w:color="D9D9D9"/>
-              <w:insideV w:val="single" w:sz="4" w:color="D9D9D9"/>
-            </w:tcBorders>
-            <w:tcMar>
-              <w:top w:w="85" w:type="dxa"/>
-              <w:start w:w="95" w:type="dxa"/>
-              <w:bottom w:w="85" w:type="dxa"/>
-              <w:end w:w="95" w:type="dxa"/>
-            </w:tcMar>
-          </w:tcPr>
-          <w:p>
-            <w:pPr>
-              <w:spacing w:after="0" w:line="259" w:lineRule="auto"/>
-              <w:jc w:val="center"/>
-            </w:pPr>
-            <w:r>
-              <w:rPr>
-                <w:rFonts w:ascii="Microsoft YaHei" w:hAnsi="Microsoft YaHei" w:eastAsia="Microsoft YaHei"/>
-                <w:b w:val="0"/>
-                <w:color w:val="000000"/>
-                <w:sz w:val="16"/>
-              </w:rPr>
-              <w:t>提交人姓名待填写。</w:t>
-            </w:r>
-          </w:p>
-        </w:tc>
-      </w:tr>
-    </w:tbl>
-    <w:p>
-      <w:pPr>
-        <w:spacing w:after="40"/>
-      </w:pPr>
-    </w:p>
     <w:sectPr>
       <w:headerReference w:type="default" r:id="rId9"/>
       <w:footerReference w:type="default" r:id="rId10"/>
@@ -3994,7 +4723,7 @@
         <w:color w:val="555555"/>
         <w:sz w:val="16"/>
       </w:rPr>
-      <w:t>Hospital Patient Pathway  |  V1.0</w:t>
+      <w:t>Hospital Patient Pathway  |  V1.1</w:t>
     </w:r>
     <w:r>
       <w:tab/>

</xml_diff>